<commit_message>
feat: add meeting summary and action items from March 23, 2026 kickoff meeting
</commit_message>
<xml_diff>
--- a/Progress_Report_1_EGN4950C.docx
+++ b/Progress_Report_1_EGN4950C.docx
@@ -238,7 +238,7 @@
           <w:sz w:val="22"/>
           <w:szCs w:val="22"/>
         </w:rPr>
-        <w:t xml:space="preserve">Did you meet as a team this period? </w:t>
+        <w:t xml:space="preserve">Did the team meet this period? </w:t>
       </w:r>
       <w:r>
         <w:rPr>
@@ -269,7 +269,7 @@
           <w:sz w:val="22"/>
           <w:szCs w:val="22"/>
         </w:rPr>
-        <w:t xml:space="preserve">Monday, March 23, 2026 at 3:00 PM via MS Teams (combined with sponsor kickoff)</w:t>
+        <w:t xml:space="preserve">Monday, March 23, 2026 at 3:00 PM via MS Teams</w:t>
       </w:r>
     </w:p>
     <w:p>
@@ -320,7 +320,159 @@
     </w:p>
     <w:p>
       <w:pPr>
-        <w:spacing w:after="0" w:before="80"/>
+        <w:spacing w:after="80"/>
+      </w:pPr>
+      <w:r>
+        <w:rPr>
+          <w:rFonts w:ascii="Arial" w:cs="Arial" w:eastAsia="Arial" w:hAnsi="Arial"/>
+          <w:b/>
+          <w:bCs/>
+          <w:sz w:val="22"/>
+          <w:szCs w:val="22"/>
+        </w:rPr>
+        <w:t xml:space="preserve">Meeting format: </w:t>
+      </w:r>
+      <w:r>
+        <w:rPr>
+          <w:rFonts w:ascii="Arial" w:cs="Arial" w:eastAsia="Arial" w:hAnsi="Arial"/>
+          <w:sz w:val="22"/>
+          <w:szCs w:val="22"/>
+        </w:rPr>
+        <w:t xml:space="preserve">MS Teams (combined team meeting and sponsor kickoff)</w:t>
+      </w:r>
+    </w:p>
+    <w:p>
+      <w:pPr>
+        <w:spacing w:after="0" w:before="60"/>
+      </w:pPr>
+    </w:p>
+    <w:p>
+      <w:pPr>
+        <w:spacing w:after="40"/>
+      </w:pPr>
+      <w:r>
+        <w:rPr>
+          <w:rFonts w:ascii="Arial" w:cs="Arial" w:eastAsia="Arial" w:hAnsi="Arial"/>
+          <w:b/>
+          <w:bCs/>
+          <w:color w:val="2C3E6B"/>
+          <w:sz w:val="22"/>
+          <w:szCs w:val="22"/>
+        </w:rPr>
+        <w:t xml:space="preserve">Meeting Agenda</w:t>
+      </w:r>
+    </w:p>
+    <w:p>
+      <w:pPr>
+        <w:pStyle w:val="ListParagraph"/>
+        <w:numPr>
+          <w:ilvl w:val="0"/>
+          <w:numId w:val="2"/>
+        </w:numPr>
+        <w:spacing w:after="80"/>
+      </w:pPr>
+      <w:r>
+        <w:rPr>
+          <w:rFonts w:ascii="Arial" w:cs="Arial" w:eastAsia="Arial" w:hAnsi="Arial"/>
+          <w:sz w:val="22"/>
+          <w:szCs w:val="22"/>
+        </w:rPr>
+        <w:t xml:space="preserve">Sponsor introductions and project overview</w:t>
+      </w:r>
+    </w:p>
+    <w:p>
+      <w:pPr>
+        <w:pStyle w:val="ListParagraph"/>
+        <w:numPr>
+          <w:ilvl w:val="0"/>
+          <w:numId w:val="2"/>
+        </w:numPr>
+        <w:spacing w:after="80"/>
+      </w:pPr>
+      <w:r>
+        <w:rPr>
+          <w:rFonts w:ascii="Arial" w:cs="Arial" w:eastAsia="Arial" w:hAnsi="Arial"/>
+          <w:sz w:val="22"/>
+          <w:szCs w:val="22"/>
+        </w:rPr>
+        <w:t xml:space="preserve">Confirm project scope: camera type, target objects, and storage constraints</w:t>
+      </w:r>
+    </w:p>
+    <w:p>
+      <w:pPr>
+        <w:pStyle w:val="ListParagraph"/>
+        <w:numPr>
+          <w:ilvl w:val="0"/>
+          <w:numId w:val="2"/>
+        </w:numPr>
+        <w:spacing w:after="80"/>
+      </w:pPr>
+      <w:r>
+        <w:rPr>
+          <w:rFonts w:ascii="Arial" w:cs="Arial" w:eastAsia="Arial" w:hAnsi="Arial"/>
+          <w:sz w:val="22"/>
+          <w:szCs w:val="22"/>
+        </w:rPr>
+        <w:t xml:space="preserve">Clarify open source and codec requirements for the deliverable</w:t>
+      </w:r>
+    </w:p>
+    <w:p>
+      <w:pPr>
+        <w:pStyle w:val="ListParagraph"/>
+        <w:numPr>
+          <w:ilvl w:val="0"/>
+          <w:numId w:val="2"/>
+        </w:numPr>
+        <w:spacing w:after="80"/>
+      </w:pPr>
+      <w:r>
+        <w:rPr>
+          <w:rFonts w:ascii="Arial" w:cs="Arial" w:eastAsia="Arial" w:hAnsi="Arial"/>
+          <w:sz w:val="22"/>
+          <w:szCs w:val="22"/>
+        </w:rPr>
+        <w:t xml:space="preserve">Discuss compression approach and baseline target (6x data reduction)</w:t>
+      </w:r>
+    </w:p>
+    <w:p>
+      <w:pPr>
+        <w:pStyle w:val="ListParagraph"/>
+        <w:numPr>
+          <w:ilvl w:val="0"/>
+          <w:numId w:val="2"/>
+        </w:numPr>
+        <w:spacing w:after="80"/>
+      </w:pPr>
+      <w:r>
+        <w:rPr>
+          <w:rFonts w:ascii="Arial" w:cs="Arial" w:eastAsia="Arial" w:hAnsi="Arial"/>
+          <w:sz w:val="22"/>
+          <w:szCs w:val="22"/>
+        </w:rPr>
+        <w:t xml:space="preserve">Explore AI upscaling and encryption as potential scope additions</w:t>
+      </w:r>
+    </w:p>
+    <w:p>
+      <w:pPr>
+        <w:pStyle w:val="ListParagraph"/>
+        <w:numPr>
+          <w:ilvl w:val="0"/>
+          <w:numId w:val="2"/>
+        </w:numPr>
+        <w:spacing w:after="80"/>
+      </w:pPr>
+      <w:r>
+        <w:rPr>
+          <w:rFonts w:ascii="Arial" w:cs="Arial" w:eastAsia="Arial" w:hAnsi="Arial"/>
+          <w:sz w:val="22"/>
+          <w:szCs w:val="22"/>
+        </w:rPr>
+        <w:t xml:space="preserve">Review ROADMAP.md milestones and confirm Milestone 1 target of March 31</w:t>
+      </w:r>
+    </w:p>
+    <w:p>
+      <w:pPr>
+        <w:spacing w:after="0" w:before="60"/>
       </w:pPr>
     </w:p>
     <w:p>
@@ -351,7 +503,7 @@
           <w:sz w:val="22"/>
           <w:szCs w:val="22"/>
         </w:rPr>
-        <w:t xml:space="preserve">Did you meet with your sponsor this period? </w:t>
+        <w:t xml:space="preserve">Did the team meet with the sponsor this period? </w:t>
       </w:r>
       <w:r>
         <w:rPr>
@@ -428,7 +580,30 @@
           <w:sz w:val="22"/>
           <w:szCs w:val="22"/>
         </w:rPr>
-        <w:t xml:space="preserve">Cody Hayashi, Engineer at Naval Information Warfare Center (NIWC) Pacific, Hawaii</w:t>
+        <w:t xml:space="preserve">Cody Hayashi, Engineer, Naval Information Warfare Center (NIWC) Pacific, Hawaii</w:t>
+      </w:r>
+    </w:p>
+    <w:p>
+      <w:pPr>
+        <w:spacing w:after="80"/>
+      </w:pPr>
+      <w:r>
+        <w:rPr>
+          <w:rFonts w:ascii="Arial" w:cs="Arial" w:eastAsia="Arial" w:hAnsi="Arial"/>
+          <w:b/>
+          <w:bCs/>
+          <w:sz w:val="22"/>
+          <w:szCs w:val="22"/>
+        </w:rPr>
+        <w:t xml:space="preserve">Co-mentor: </w:t>
+      </w:r>
+      <w:r>
+        <w:rPr>
+          <w:rFonts w:ascii="Arial" w:cs="Arial" w:eastAsia="Arial" w:hAnsi="Arial"/>
+          <w:sz w:val="22"/>
+          <w:szCs w:val="22"/>
+        </w:rPr>
+        <w:t xml:space="preserve">Gina (Jinel Wang Kung), manages commercial surveillance systems on Navy bases</w:t>
       </w:r>
     </w:p>
     <w:p>
@@ -438,17 +613,18 @@
     </w:p>
     <w:p>
       <w:pPr>
-        <w:spacing w:after="60"/>
-      </w:pPr>
-      <w:r>
-        <w:rPr>
-          <w:rFonts w:ascii="Arial" w:cs="Arial" w:eastAsia="Arial" w:hAnsi="Arial"/>
-          <w:b/>
-          <w:bCs/>
-          <w:sz w:val="22"/>
-          <w:szCs w:val="22"/>
-        </w:rPr>
-        <w:t xml:space="preserve">Summary of meeting:</w:t>
+        <w:spacing w:after="40"/>
+      </w:pPr>
+      <w:r>
+        <w:rPr>
+          <w:rFonts w:ascii="Arial" w:cs="Arial" w:eastAsia="Arial" w:hAnsi="Arial"/>
+          <w:b/>
+          <w:bCs/>
+          <w:color w:val="2C3E6B"/>
+          <w:sz w:val="22"/>
+          <w:szCs w:val="22"/>
+        </w:rPr>
+        <w:t xml:space="preserve">Meeting Summary</w:t>
       </w:r>
     </w:p>
     <w:p>
@@ -461,7 +637,25 @@
           <w:sz w:val="22"/>
           <w:szCs w:val="22"/>
         </w:rPr>
-        <w:t xml:space="preserve">The team held its kickoff meeting with sponsor Cody Hayashi from NIWC Pacific. Cody co-mentors with Gina (Jinel Wang Kung), who manages commercial surveillance systems on Navy bases. The core problem statement was confirmed: Navy base cameras overwrite footage after approximately one week due to storage constraints. The goal is intelligent compression that retains foreground objects of interest at high quality while aggressively compressing background pixels.</w:t>
+        <w:t xml:space="preserve">The core problem statement was confirmed: Navy base cameras overwrite footage after approximately one week due to storage constraints. The system must intelligently compress footage by retaining foreground objects of interest at high quality while aggressively compressing static background pixels. Scope is limited to land-based static cameras at base entry points. PTZ cameras, port cameras, and water-side cameras are explicitly out of scope. Target objects are people and vehicles.</w:t>
+      </w:r>
+    </w:p>
+    <w:p>
+      <w:pPr>
+        <w:spacing w:after="0" w:before="40"/>
+      </w:pPr>
+    </w:p>
+    <w:p>
+      <w:pPr>
+        <w:spacing w:after="120"/>
+      </w:pPr>
+      <w:r>
+        <w:rPr>
+          <w:rFonts w:ascii="Arial" w:cs="Arial" w:eastAsia="Arial" w:hAnsi="Arial"/>
+          <w:sz w:val="22"/>
+          <w:szCs w:val="22"/>
+        </w:rPr>
+        <w:t xml:space="preserve">Sponsor direction: all code and codecs must be open source and royalty-free, with a public GitHub repository as the primary deliverable. The baseline target is 6x data reduction, matching the sponsor's prior YOLO-based frame-drop experiment. Cody confirmed AI upscaling for low-quality footage is in scope, with acknowledged hallucination risk for fine details such as license plates. Video encryption was noted as a potential stretch goal given Victor's cybersecurity background. The sponsor requested weekly informal meetings with slide or video demos of progress.</w:t>
       </w:r>
     </w:p>
     <w:p>
@@ -471,15 +665,216 @@
     </w:p>
     <w:p>
       <w:pPr>
-        <w:spacing w:after="120"/>
-      </w:pPr>
-      <w:r>
-        <w:rPr>
-          <w:rFonts w:ascii="Arial" w:cs="Arial" w:eastAsia="Arial" w:hAnsi="Arial"/>
-          <w:sz w:val="22"/>
-          <w:szCs w:val="22"/>
-        </w:rPr>
-        <w:t xml:space="preserve">Key decisions confirmed at the meeting: the system must focus on land-based static cameras only (no PTZ, no port or water cameras); target objects are people and vehicles at base entry points; all code and codecs must be open source and royalty-free with a public GitHub deliverable. The sponsor's prior experiment using YOLO-based frame-drop achieved approximately 6x data reduction, which is the baseline target. Cody noted that AI upscaling for low-quality footage is in scope, and that video encryption could be a stretch goal given Victor's cybersecurity background.</w:t>
+        <w:spacing w:after="40"/>
+      </w:pPr>
+      <w:r>
+        <w:rPr>
+          <w:rFonts w:ascii="Arial" w:cs="Arial" w:eastAsia="Arial" w:hAnsi="Arial"/>
+          <w:b/>
+          <w:bCs/>
+          <w:color w:val="2C3E6B"/>
+          <w:sz w:val="22"/>
+          <w:szCs w:val="22"/>
+        </w:rPr>
+        <w:t xml:space="preserve">Action Items from Meeting</w:t>
+      </w:r>
+    </w:p>
+    <w:p>
+      <w:pPr>
+        <w:pStyle w:val="ListParagraph"/>
+        <w:numPr>
+          <w:ilvl w:val="0"/>
+          <w:numId w:val="2"/>
+        </w:numPr>
+        <w:spacing w:after="80"/>
+      </w:pPr>
+      <w:r>
+        <w:rPr>
+          <w:rFonts w:ascii="Arial" w:cs="Arial" w:eastAsia="Arial" w:hAnsi="Arial"/>
+          <w:sz w:val="22"/>
+          <w:szCs w:val="22"/>
+        </w:rPr>
+        <w:t xml:space="preserve">All members: review ROADMAP.md and confirm task ownership for Milestone 1 by March 24</w:t>
+      </w:r>
+    </w:p>
+    <w:p>
+      <w:pPr>
+        <w:pStyle w:val="ListParagraph"/>
+        <w:numPr>
+          <w:ilvl w:val="0"/>
+          <w:numId w:val="2"/>
+        </w:numPr>
+        <w:spacing w:after="80"/>
+      </w:pPr>
+      <w:r>
+        <w:rPr>
+          <w:rFonts w:ascii="Arial" w:cs="Arial" w:eastAsia="Arial" w:hAnsi="Arial"/>
+          <w:sz w:val="22"/>
+          <w:szCs w:val="22"/>
+        </w:rPr>
+        <w:t xml:space="preserve">Kheiven: complete background subtraction tuning and unit tests (Section 1.1) by March 29</w:t>
+      </w:r>
+    </w:p>
+    <w:p>
+      <w:pPr>
+        <w:pStyle w:val="ListParagraph"/>
+        <w:numPr>
+          <w:ilvl w:val="0"/>
+          <w:numId w:val="2"/>
+        </w:numPr>
+        <w:spacing w:after="80"/>
+      </w:pPr>
+      <w:r>
+        <w:rPr>
+          <w:rFonts w:ascii="Arial" w:cs="Arial" w:eastAsia="Arial" w:hAnsi="Arial"/>
+          <w:sz w:val="22"/>
+          <w:szCs w:val="22"/>
+        </w:rPr>
+        <w:t xml:space="preserve">Jorge: complete ROI encoding pipeline and integration tests (Section 1.2) by March 29</w:t>
+      </w:r>
+    </w:p>
+    <w:p>
+      <w:pPr>
+        <w:pStyle w:val="ListParagraph"/>
+        <w:numPr>
+          <w:ilvl w:val="0"/>
+          <w:numId w:val="2"/>
+        </w:numPr>
+        <w:spacing w:after="80"/>
+      </w:pPr>
+      <w:r>
+        <w:rPr>
+          <w:rFonts w:ascii="Arial" w:cs="Arial" w:eastAsia="Arial" w:hAnsi="Arial"/>
+          <w:sz w:val="22"/>
+          <w:szCs w:val="22"/>
+        </w:rPr>
+        <w:t xml:space="preserve">Ashleyn: complete metadata database and pipeline integration (Section 1.4) by March 28</w:t>
+      </w:r>
+    </w:p>
+    <w:p>
+      <w:pPr>
+        <w:pStyle w:val="ListParagraph"/>
+        <w:numPr>
+          <w:ilvl w:val="0"/>
+          <w:numId w:val="2"/>
+        </w:numPr>
+        <w:spacing w:after="80"/>
+      </w:pPr>
+      <w:r>
+        <w:rPr>
+          <w:rFonts w:ascii="Arial" w:cs="Arial" w:eastAsia="Arial" w:hAnsi="Arial"/>
+          <w:sz w:val="22"/>
+          <w:szCs w:val="22"/>
+        </w:rPr>
+        <w:t xml:space="preserve">Victor: implement metrics and create benchmark notebook (Section 1.3) by March 30</w:t>
+      </w:r>
+    </w:p>
+    <w:p>
+      <w:pPr>
+        <w:pStyle w:val="ListParagraph"/>
+        <w:numPr>
+          <w:ilvl w:val="0"/>
+          <w:numId w:val="2"/>
+        </w:numPr>
+        <w:spacing w:after="80"/>
+      </w:pPr>
+      <w:r>
+        <w:rPr>
+          <w:rFonts w:ascii="Arial" w:cs="Arial" w:eastAsia="Arial" w:hAnsi="Arial"/>
+          <w:sz w:val="22"/>
+          <w:szCs w:val="22"/>
+        </w:rPr>
+        <w:t xml:space="preserve">Kheiven: set up MS Teams Planner with tasks and due dates through April 27 by March 30</w:t>
+      </w:r>
+    </w:p>
+    <w:p>
+      <w:pPr>
+        <w:spacing w:after="0" w:before="60"/>
+      </w:pPr>
+    </w:p>
+    <w:p>
+      <w:pPr>
+        <w:spacing w:after="40"/>
+      </w:pPr>
+      <w:r>
+        <w:rPr>
+          <w:rFonts w:ascii="Arial" w:cs="Arial" w:eastAsia="Arial" w:hAnsi="Arial"/>
+          <w:b/>
+          <w:bCs/>
+          <w:color w:val="2C3E6B"/>
+          <w:sz w:val="22"/>
+          <w:szCs w:val="22"/>
+        </w:rPr>
+        <w:t xml:space="preserve">Next Meeting</w:t>
+      </w:r>
+    </w:p>
+    <w:p>
+      <w:pPr>
+        <w:spacing w:after="80"/>
+      </w:pPr>
+      <w:r>
+        <w:rPr>
+          <w:rFonts w:ascii="Arial" w:cs="Arial" w:eastAsia="Arial" w:hAnsi="Arial"/>
+          <w:b/>
+          <w:bCs/>
+          <w:sz w:val="22"/>
+          <w:szCs w:val="22"/>
+        </w:rPr>
+        <w:t xml:space="preserve">Proposed cadence: </w:t>
+      </w:r>
+      <w:r>
+        <w:rPr>
+          <w:rFonts w:ascii="Arial" w:cs="Arial" w:eastAsia="Arial" w:hAnsi="Arial"/>
+          <w:sz w:val="22"/>
+          <w:szCs w:val="22"/>
+        </w:rPr>
+        <w:t xml:space="preserve">Weekly via MS Teams (informal, slide or video demo format per sponsor preference)</w:t>
+      </w:r>
+    </w:p>
+    <w:p>
+      <w:pPr>
+        <w:spacing w:after="80"/>
+      </w:pPr>
+      <w:r>
+        <w:rPr>
+          <w:rFonts w:ascii="Arial" w:cs="Arial" w:eastAsia="Arial" w:hAnsi="Arial"/>
+          <w:b/>
+          <w:bCs/>
+          <w:sz w:val="22"/>
+          <w:szCs w:val="22"/>
+        </w:rPr>
+        <w:t xml:space="preserve">Agenda: </w:t>
+      </w:r>
+      <w:r>
+        <w:rPr>
+          <w:rFonts w:ascii="Arial" w:cs="Arial" w:eastAsia="Arial" w:hAnsi="Arial"/>
+          <w:sz w:val="22"/>
+          <w:szCs w:val="22"/>
+        </w:rPr>
+        <w:t xml:space="preserve">Milestone 1 sign-off demo, compression ratio and PSNR results, Milestone 2 task assignments</w:t>
+      </w:r>
+    </w:p>
+    <w:p>
+      <w:pPr>
+        <w:spacing w:after="80"/>
+      </w:pPr>
+      <w:r>
+        <w:rPr>
+          <w:rFonts w:ascii="Arial" w:cs="Arial" w:eastAsia="Arial" w:hAnsi="Arial"/>
+          <w:b/>
+          <w:bCs/>
+          <w:sz w:val="22"/>
+          <w:szCs w:val="22"/>
+        </w:rPr>
+        <w:t xml:space="preserve">Note: </w:t>
+      </w:r>
+      <w:r>
+        <w:rPr>
+          <w:rFonts w:ascii="Arial" w:cs="Arial" w:eastAsia="Arial" w:hAnsi="Arial"/>
+          <w:sz w:val="22"/>
+          <w:szCs w:val="22"/>
+        </w:rPr>
+        <w:t xml:space="preserve">Sponsor is based in Hawaii (HST, 6 hours behind EST). Schedule meetings accordingly.</w:t>
       </w:r>
     </w:p>
     <w:p>
@@ -2635,6 +3030,45 @@
     </w:p>
     <w:p>
       <w:pPr>
+        <w:pBdr>
+          <w:top w:val="single" w:color="F5A623" w:sz="4" w:space="1"/>
+          <w:bottom w:val="single" w:color="F5A623" w:sz="4" w:space="1"/>
+          <w:left w:val="single" w:color="F5A623" w:sz="12" w:space="4"/>
+          <w:right w:val="single" w:color="F5A623" w:sz="4" w:space="1"/>
+        </w:pBdr>
+        <w:shd w:fill="FFF8E1" w:val="clear"/>
+        <w:spacing w:after="120" w:before="120"/>
+      </w:pPr>
+      <w:r>
+        <w:rPr>
+          <w:rFonts w:ascii="Arial" w:cs="Arial" w:eastAsia="Arial" w:hAnsi="Arial"/>
+          <w:b/>
+          <w:bCs/>
+          <w:color w:val="C07800"/>
+          <w:sz w:val="20"/>
+          <w:szCs w:val="20"/>
+        </w:rPr>
+        <w:t xml:space="preserve">Note from Kheiven: </w:t>
+      </w:r>
+      <w:r>
+        <w:rPr>
+          <w:rFonts w:ascii="Arial" w:cs="Arial" w:eastAsia="Arial" w:hAnsi="Arial"/>
+          <w:i/>
+          <w:iCs/>
+          <w:color w:val="7A5000"/>
+          <w:sz w:val="20"/>
+          <w:szCs w:val="20"/>
+        </w:rPr>
+        <w:t xml:space="preserve">Riley, since you wrote less code this session, you should lead the group discussion in the next meeting.</w:t>
+      </w:r>
+    </w:p>
+    <w:p>
+      <w:pPr>
+        <w:spacing w:after="0" w:before="80"/>
+      </w:pPr>
+    </w:p>
+    <w:p>
+      <w:pPr>
         <w:spacing w:after="60" w:before="200"/>
       </w:pPr>
       <w:r>

</xml_diff>